<commit_message>
PROVA 2 - parte 2
</commit_message>
<xml_diff>
--- a/PROVA 2/Phillipe Gabriel da Silva Littig Mugnaini - Avaliação II de programação de aplicativos.docx
+++ b/PROVA 2/Phillipe Gabriel da Silva Littig Mugnaini - Avaliação II de programação de aplicativos.docx
@@ -31,6 +31,27 @@
         <w:rPr>
           <w:rtl w:val="0"/>
         </w:rPr>
+        <w:t xml:space="preserve">PARTE 1</w:t>
+      </w:r>
+    </w:p>
+    <w:p>
+      <w:pPr>
+        <w:rPr/>
+      </w:pPr>
+      <w:r>
+        <w:rPr>
+          <w:rtl w:val="0"/>
+        </w:rPr>
+      </w:r>
+    </w:p>
+    <w:p>
+      <w:pPr>
+        <w:rPr/>
+      </w:pPr>
+      <w:r>
+        <w:rPr>
+          <w:rtl w:val="0"/>
+        </w:rPr>
         <w:t xml:space="preserve">1 - c</w:t>
       </w:r>
     </w:p>
@@ -316,6 +337,65 @@
           <w:rtl w:val="0"/>
         </w:rPr>
         <w:t xml:space="preserve">R: Separando o código em diferentes arquivos se cria uma arquitetura onde deixa o código mais organizado e maior facilidade de se localizar pelo projeto.</w:t>
+      </w:r>
+    </w:p>
+    <w:p>
+      <w:pPr>
+        <w:rPr/>
+      </w:pPr>
+      <w:r>
+        <w:rPr>
+          <w:rtl w:val="0"/>
+        </w:rPr>
+      </w:r>
+    </w:p>
+    <w:p>
+      <w:pPr>
+        <w:rPr/>
+      </w:pPr>
+      <w:r>
+        <w:rPr>
+          <w:rtl w:val="0"/>
+        </w:rPr>
+        <w:t xml:space="preserve">PARTE 2</w:t>
+      </w:r>
+    </w:p>
+    <w:p>
+      <w:pPr>
+        <w:rPr/>
+      </w:pPr>
+      <w:r>
+        <w:rPr>
+          <w:rtl w:val="0"/>
+        </w:rPr>
+        <w:t xml:space="preserve"> </w:t>
+      </w:r>
+    </w:p>
+    <w:p>
+      <w:pPr>
+        <w:rPr>
+          <w:b w:val="1"/>
+          <w:bCs w:val="1"/>
+        </w:rPr>
+      </w:pPr>
+      <w:r>
+        <w:rPr>
+          <w:b w:val="1"/>
+          <w:bCs w:val="1"/>
+          <w:rtl w:val="0"/>
+        </w:rPr>
+        <w:t xml:space="preserve">13.Explique o que o código abaixo faz:</w:t>
+      </w:r>
+    </w:p>
+    <w:p>
+      <w:pPr>
+        <w:rPr/>
+      </w:pPr>
+      <w:r>
+        <w:rPr>
+          <w:rtl w:val="0"/>
+        </w:rPr>
+        <w:t xml:space="preserve">R: O código retorna a todos os usuários cadastrados na rota “/usuarios”</w:t>
       </w:r>
     </w:p>
     <w:p>

</xml_diff>

<commit_message>
PROVA 2 - parte 3
</commit_message>
<xml_diff>
--- a/PROVA 2/Phillipe Gabriel da Silva Littig Mugnaini - Avaliação II de programação de aplicativos.docx
+++ b/PROVA 2/Phillipe Gabriel da Silva Littig Mugnaini - Avaliação II de programação de aplicativos.docx
@@ -412,6 +412,617 @@
       <w:pPr>
         <w:rPr/>
       </w:pPr>
+      <w:r>
+        <w:rPr>
+          <w:rtl w:val="0"/>
+        </w:rPr>
+      </w:r>
+    </w:p>
+    <w:p>
+      <w:pPr>
+        <w:rPr/>
+      </w:pPr>
+      <w:r>
+        <w:rPr>
+          <w:rtl w:val="0"/>
+        </w:rPr>
+      </w:r>
+    </w:p>
+    <w:p>
+      <w:pPr>
+        <w:rPr/>
+      </w:pPr>
+      <w:r>
+        <w:rPr>
+          <w:rtl w:val="0"/>
+        </w:rPr>
+      </w:r>
+    </w:p>
+    <w:p>
+      <w:pPr>
+        <w:rPr/>
+      </w:pPr>
+      <w:r>
+        <w:rPr>
+          <w:rtl w:val="0"/>
+        </w:rPr>
+      </w:r>
+    </w:p>
+    <w:p>
+      <w:pPr>
+        <w:rPr/>
+      </w:pPr>
+      <w:r>
+        <w:rPr>
+          <w:rtl w:val="0"/>
+        </w:rPr>
+      </w:r>
+    </w:p>
+    <w:p>
+      <w:pPr>
+        <w:rPr/>
+      </w:pPr>
+      <w:r>
+        <w:rPr>
+          <w:rtl w:val="0"/>
+        </w:rPr>
+      </w:r>
+    </w:p>
+    <w:p>
+      <w:pPr>
+        <w:rPr/>
+      </w:pPr>
+      <w:r>
+        <w:rPr>
+          <w:rtl w:val="0"/>
+        </w:rPr>
+      </w:r>
+    </w:p>
+    <w:p>
+      <w:pPr>
+        <w:rPr/>
+      </w:pPr>
+      <w:r>
+        <w:rPr>
+          <w:rtl w:val="0"/>
+        </w:rPr>
+      </w:r>
+    </w:p>
+    <w:p>
+      <w:pPr>
+        <w:rPr/>
+      </w:pPr>
+      <w:r>
+        <w:rPr>
+          <w:rtl w:val="0"/>
+        </w:rPr>
+      </w:r>
+    </w:p>
+    <w:p>
+      <w:pPr>
+        <w:rPr/>
+      </w:pPr>
+      <w:r>
+        <w:rPr>
+          <w:rtl w:val="0"/>
+        </w:rPr>
+      </w:r>
+    </w:p>
+    <w:p>
+      <w:pPr>
+        <w:rPr/>
+      </w:pPr>
+      <w:r>
+        <w:rPr>
+          <w:rtl w:val="0"/>
+        </w:rPr>
+      </w:r>
+    </w:p>
+    <w:p>
+      <w:pPr>
+        <w:rPr/>
+      </w:pPr>
+      <w:r>
+        <w:rPr>
+          <w:rtl w:val="0"/>
+        </w:rPr>
+      </w:r>
+    </w:p>
+    <w:p>
+      <w:pPr>
+        <w:rPr/>
+      </w:pPr>
+      <w:r>
+        <w:rPr>
+          <w:rtl w:val="0"/>
+        </w:rPr>
+      </w:r>
+    </w:p>
+    <w:p>
+      <w:pPr>
+        <w:rPr/>
+      </w:pPr>
+      <w:r>
+        <w:rPr>
+          <w:rtl w:val="0"/>
+        </w:rPr>
+        <w:t xml:space="preserve">PARTE 3</w:t>
+      </w:r>
+    </w:p>
+    <w:p>
+      <w:pPr>
+        <w:rPr/>
+      </w:pPr>
+      <w:r>
+        <w:rPr>
+          <w:rtl w:val="0"/>
+        </w:rPr>
+      </w:r>
+    </w:p>
+    <w:p>
+      <w:pPr>
+        <w:rPr/>
+      </w:pPr>
+      <w:r>
+        <w:rPr>
+          <w:rtl w:val="0"/>
+        </w:rPr>
+        <w:t xml:space="preserve">GET</w:t>
+      </w:r>
+    </w:p>
+    <w:p>
+      <w:pPr>
+        <w:rPr/>
+      </w:pPr>
+      <w:r>
+        <w:rPr/>
+        <w:drawing>
+          <wp:inline distB="114300" distT="114300" distL="114300" distR="114300">
+            <wp:extent cx="5731200" cy="3009900"/>
+            <wp:effectExtent b="0" l="0" r="0" t="0"/>
+            <wp:docPr id="4" name="image3.png"/>
+            <a:graphic>
+              <a:graphicData uri="http://schemas.openxmlformats.org/drawingml/2006/picture">
+                <pic:pic>
+                  <pic:nvPicPr>
+                    <pic:cNvPr id="0" name="image3.png"/>
+                    <pic:cNvPicPr preferRelativeResize="0"/>
+                  </pic:nvPicPr>
+                  <pic:blipFill>
+                    <a:blip r:embed="rId6"/>
+                    <a:srcRect b="0" l="0" r="0" t="0"/>
+                    <a:stretch>
+                      <a:fillRect/>
+                    </a:stretch>
+                  </pic:blipFill>
+                  <pic:spPr>
+                    <a:xfrm>
+                      <a:off x="0" y="0"/>
+                      <a:ext cx="5731200" cy="3009900"/>
+                    </a:xfrm>
+                    <a:prstGeom prst="rect"/>
+                    <a:ln/>
+                  </pic:spPr>
+                </pic:pic>
+              </a:graphicData>
+            </a:graphic>
+          </wp:inline>
+        </w:drawing>
+      </w:r>
+      <w:r>
+        <w:rPr>
+          <w:rtl w:val="0"/>
+        </w:rPr>
+      </w:r>
+    </w:p>
+    <w:p>
+      <w:pPr>
+        <w:rPr/>
+      </w:pPr>
+      <w:r>
+        <w:rPr>
+          <w:rtl w:val="0"/>
+        </w:rPr>
+      </w:r>
+    </w:p>
+    <w:p>
+      <w:pPr>
+        <w:rPr/>
+      </w:pPr>
+      <w:r>
+        <w:rPr>
+          <w:rtl w:val="0"/>
+        </w:rPr>
+        <w:t xml:space="preserve">POST</w:t>
+      </w:r>
+    </w:p>
+    <w:p>
+      <w:pPr>
+        <w:rPr/>
+      </w:pPr>
+      <w:r>
+        <w:rPr/>
+        <w:drawing>
+          <wp:inline distB="114300" distT="114300" distL="114300" distR="114300">
+            <wp:extent cx="5731200" cy="3746500"/>
+            <wp:effectExtent b="0" l="0" r="0" t="0"/>
+            <wp:docPr id="5" name="image1.png"/>
+            <a:graphic>
+              <a:graphicData uri="http://schemas.openxmlformats.org/drawingml/2006/picture">
+                <pic:pic>
+                  <pic:nvPicPr>
+                    <pic:cNvPr id="0" name="image1.png"/>
+                    <pic:cNvPicPr preferRelativeResize="0"/>
+                  </pic:nvPicPr>
+                  <pic:blipFill>
+                    <a:blip r:embed="rId7"/>
+                    <a:srcRect b="0" l="0" r="0" t="0"/>
+                    <a:stretch>
+                      <a:fillRect/>
+                    </a:stretch>
+                  </pic:blipFill>
+                  <pic:spPr>
+                    <a:xfrm>
+                      <a:off x="0" y="0"/>
+                      <a:ext cx="5731200" cy="3746500"/>
+                    </a:xfrm>
+                    <a:prstGeom prst="rect"/>
+                    <a:ln/>
+                  </pic:spPr>
+                </pic:pic>
+              </a:graphicData>
+            </a:graphic>
+          </wp:inline>
+        </w:drawing>
+      </w:r>
+      <w:r>
+        <w:rPr>
+          <w:rtl w:val="0"/>
+        </w:rPr>
+      </w:r>
+    </w:p>
+    <w:p>
+      <w:pPr>
+        <w:rPr/>
+      </w:pPr>
+      <w:r>
+        <w:rPr>
+          <w:rtl w:val="0"/>
+        </w:rPr>
+      </w:r>
+    </w:p>
+    <w:p>
+      <w:pPr>
+        <w:rPr/>
+      </w:pPr>
+      <w:r>
+        <w:rPr>
+          <w:rtl w:val="0"/>
+        </w:rPr>
+      </w:r>
+    </w:p>
+    <w:p>
+      <w:pPr>
+        <w:rPr/>
+      </w:pPr>
+      <w:r>
+        <w:rPr>
+          <w:rtl w:val="0"/>
+        </w:rPr>
+      </w:r>
+    </w:p>
+    <w:p>
+      <w:pPr>
+        <w:rPr/>
+      </w:pPr>
+      <w:r>
+        <w:rPr>
+          <w:rtl w:val="0"/>
+        </w:rPr>
+      </w:r>
+    </w:p>
+    <w:p>
+      <w:pPr>
+        <w:rPr/>
+      </w:pPr>
+      <w:r>
+        <w:rPr>
+          <w:rtl w:val="0"/>
+        </w:rPr>
+      </w:r>
+    </w:p>
+    <w:p>
+      <w:pPr>
+        <w:rPr/>
+      </w:pPr>
+      <w:r>
+        <w:rPr>
+          <w:rtl w:val="0"/>
+        </w:rPr>
+        <w:t xml:space="preserve">PUT</w:t>
+      </w:r>
+    </w:p>
+    <w:p>
+      <w:pPr>
+        <w:rPr/>
+      </w:pPr>
+      <w:r>
+        <w:rPr/>
+        <w:drawing>
+          <wp:inline distB="114300" distT="114300" distL="114300" distR="114300">
+            <wp:extent cx="5731200" cy="2997200"/>
+            <wp:effectExtent b="0" l="0" r="0" t="0"/>
+            <wp:docPr id="2" name="image4.png"/>
+            <a:graphic>
+              <a:graphicData uri="http://schemas.openxmlformats.org/drawingml/2006/picture">
+                <pic:pic>
+                  <pic:nvPicPr>
+                    <pic:cNvPr id="0" name="image4.png"/>
+                    <pic:cNvPicPr preferRelativeResize="0"/>
+                  </pic:nvPicPr>
+                  <pic:blipFill>
+                    <a:blip r:embed="rId8"/>
+                    <a:srcRect b="0" l="0" r="0" t="0"/>
+                    <a:stretch>
+                      <a:fillRect/>
+                    </a:stretch>
+                  </pic:blipFill>
+                  <pic:spPr>
+                    <a:xfrm>
+                      <a:off x="0" y="0"/>
+                      <a:ext cx="5731200" cy="2997200"/>
+                    </a:xfrm>
+                    <a:prstGeom prst="rect"/>
+                    <a:ln/>
+                  </pic:spPr>
+                </pic:pic>
+              </a:graphicData>
+            </a:graphic>
+          </wp:inline>
+        </w:drawing>
+      </w:r>
+      <w:r>
+        <w:rPr>
+          <w:rtl w:val="0"/>
+        </w:rPr>
+      </w:r>
+    </w:p>
+    <w:p>
+      <w:pPr>
+        <w:rPr/>
+      </w:pPr>
+      <w:r>
+        <w:rPr>
+          <w:rtl w:val="0"/>
+        </w:rPr>
+      </w:r>
+    </w:p>
+    <w:p>
+      <w:pPr>
+        <w:rPr/>
+      </w:pPr>
+      <w:r>
+        <w:rPr>
+          <w:rtl w:val="0"/>
+        </w:rPr>
+        <w:t xml:space="preserve">DELETE</w:t>
+      </w:r>
+    </w:p>
+    <w:p>
+      <w:pPr>
+        <w:rPr/>
+      </w:pPr>
+      <w:r>
+        <w:rPr/>
+        <w:drawing>
+          <wp:inline distB="114300" distT="114300" distL="114300" distR="114300">
+            <wp:extent cx="5731200" cy="2997200"/>
+            <wp:effectExtent b="0" l="0" r="0" t="0"/>
+            <wp:docPr id="3" name="image2.png"/>
+            <a:graphic>
+              <a:graphicData uri="http://schemas.openxmlformats.org/drawingml/2006/picture">
+                <pic:pic>
+                  <pic:nvPicPr>
+                    <pic:cNvPr id="0" name="image2.png"/>
+                    <pic:cNvPicPr preferRelativeResize="0"/>
+                  </pic:nvPicPr>
+                  <pic:blipFill>
+                    <a:blip r:embed="rId9"/>
+                    <a:srcRect b="0" l="0" r="0" t="0"/>
+                    <a:stretch>
+                      <a:fillRect/>
+                    </a:stretch>
+                  </pic:blipFill>
+                  <pic:spPr>
+                    <a:xfrm>
+                      <a:off x="0" y="0"/>
+                      <a:ext cx="5731200" cy="2997200"/>
+                    </a:xfrm>
+                    <a:prstGeom prst="rect"/>
+                    <a:ln/>
+                  </pic:spPr>
+                </pic:pic>
+              </a:graphicData>
+            </a:graphic>
+          </wp:inline>
+        </w:drawing>
+      </w:r>
+      <w:r>
+        <w:rPr>
+          <w:rtl w:val="0"/>
+        </w:rPr>
+      </w:r>
+    </w:p>
+    <w:p>
+      <w:pPr>
+        <w:rPr/>
+      </w:pPr>
+      <w:r>
+        <w:rPr>
+          <w:rtl w:val="0"/>
+        </w:rPr>
+      </w:r>
+    </w:p>
+    <w:p>
+      <w:pPr>
+        <w:rPr/>
+      </w:pPr>
+      <w:r>
+        <w:rPr>
+          <w:rtl w:val="0"/>
+        </w:rPr>
+      </w:r>
+    </w:p>
+    <w:p>
+      <w:pPr>
+        <w:rPr/>
+      </w:pPr>
+      <w:r>
+        <w:rPr>
+          <w:rtl w:val="0"/>
+        </w:rPr>
+      </w:r>
+    </w:p>
+    <w:p>
+      <w:pPr>
+        <w:rPr/>
+      </w:pPr>
+      <w:r>
+        <w:rPr>
+          <w:rtl w:val="0"/>
+        </w:rPr>
+      </w:r>
+    </w:p>
+    <w:p>
+      <w:pPr>
+        <w:rPr/>
+      </w:pPr>
+      <w:r>
+        <w:rPr>
+          <w:rtl w:val="0"/>
+        </w:rPr>
+      </w:r>
+    </w:p>
+    <w:p>
+      <w:pPr>
+        <w:rPr/>
+      </w:pPr>
+      <w:r>
+        <w:rPr>
+          <w:rtl w:val="0"/>
+        </w:rPr>
+      </w:r>
+    </w:p>
+    <w:p>
+      <w:pPr>
+        <w:rPr/>
+      </w:pPr>
+      <w:r>
+        <w:rPr>
+          <w:rtl w:val="0"/>
+        </w:rPr>
+      </w:r>
+    </w:p>
+    <w:p>
+      <w:pPr>
+        <w:rPr/>
+      </w:pPr>
+      <w:r>
+        <w:rPr>
+          <w:rtl w:val="0"/>
+        </w:rPr>
+      </w:r>
+    </w:p>
+    <w:p>
+      <w:pPr>
+        <w:rPr/>
+      </w:pPr>
+      <w:r>
+        <w:rPr>
+          <w:rtl w:val="0"/>
+        </w:rPr>
+      </w:r>
+    </w:p>
+    <w:p>
+      <w:pPr>
+        <w:rPr/>
+      </w:pPr>
+      <w:r>
+        <w:rPr>
+          <w:rtl w:val="0"/>
+        </w:rPr>
+      </w:r>
+    </w:p>
+    <w:p>
+      <w:pPr>
+        <w:rPr/>
+      </w:pPr>
+      <w:r>
+        <w:rPr>
+          <w:rtl w:val="0"/>
+        </w:rPr>
+      </w:r>
+    </w:p>
+    <w:p>
+      <w:pPr>
+        <w:rPr/>
+      </w:pPr>
+      <w:r>
+        <w:rPr>
+          <w:rtl w:val="0"/>
+        </w:rPr>
+        <w:t xml:space="preserve">GET BY SETOR</w:t>
+      </w:r>
+    </w:p>
+    <w:p>
+      <w:pPr>
+        <w:rPr/>
+      </w:pPr>
+      <w:r>
+        <w:rPr>
+          <w:rtl w:val="0"/>
+        </w:rPr>
+      </w:r>
+    </w:p>
+    <w:p>
+      <w:pPr>
+        <w:rPr/>
+      </w:pPr>
+      <w:r>
+        <w:rPr/>
+        <w:drawing>
+          <wp:inline distB="114300" distT="114300" distL="114300" distR="114300">
+            <wp:extent cx="5731200" cy="2997200"/>
+            <wp:effectExtent b="0" l="0" r="0" t="0"/>
+            <wp:docPr id="1" name="image5.png"/>
+            <a:graphic>
+              <a:graphicData uri="http://schemas.openxmlformats.org/drawingml/2006/picture">
+                <pic:pic>
+                  <pic:nvPicPr>
+                    <pic:cNvPr id="0" name="image5.png"/>
+                    <pic:cNvPicPr preferRelativeResize="0"/>
+                  </pic:nvPicPr>
+                  <pic:blipFill>
+                    <a:blip r:embed="rId10"/>
+                    <a:srcRect b="0" l="0" r="0" t="0"/>
+                    <a:stretch>
+                      <a:fillRect/>
+                    </a:stretch>
+                  </pic:blipFill>
+                  <pic:spPr>
+                    <a:xfrm>
+                      <a:off x="0" y="0"/>
+                      <a:ext cx="5731200" cy="2997200"/>
+                    </a:xfrm>
+                    <a:prstGeom prst="rect"/>
+                    <a:ln/>
+                  </pic:spPr>
+                </pic:pic>
+              </a:graphicData>
+            </a:graphic>
+          </wp:inline>
+        </w:drawing>
+      </w:r>
       <w:r>
         <w:rPr>
           <w:rtl w:val="0"/>

</xml_diff>